<commit_message>
Release v0.4.6 installation path fixes
</commit_message>
<xml_diff>
--- a/release/小剧场收藏夹-安装手册-PC安卓云服务器.docx
+++ b/release/小剧场收藏夹-安装手册-PC安卓云服务器.docx
@@ -175,7 +175,7 @@
     </w:p>
     <w:p>
       <w:r>
-        <w:t>打开你的 SillyTavern 文件夹，依次进入下面的位置，双击 install-server-plugin.bat。</w:t>
+        <w:t>打开你的 SillyTavern 文件夹，搜索 install-server-plugin.bat。确认它位于 sillytavern-theater-favorites 文件夹中，然后双击运行。</w:t>
       </w:r>
     </w:p>
     <w:tbl>
@@ -201,7 +201,9 @@
                 <w:rFonts w:ascii="Consolas" w:hAnsi="Consolas"/>
                 <w:sz w:val="18"/>
               </w:rPr>
-              <w:t>SillyTavern\public\scripts\extensions\third-party\theater-favorites\install-server-plugin.bat</w:t>
+              <w:t>在 SillyTavern 文件夹中搜索：install-server-plugin.bat</w:t>
+              <w:br/>
+              <w:t>正确文件夹：sillytavern-theater-favorites</w:t>
             </w:r>
           </w:p>
         </w:tc>
@@ -291,7 +293,7 @@
     </w:p>
     <w:p>
       <w:r>
-        <w:t>如果你的 SillyTavern 文件夹就在 Termux 当前目录，粘贴下面这行。</w:t>
+        <w:t>复制下面完整一行，粘贴到 Termux 后按 Enter。命令会进入 SillyTavern，并自动找到当前用户或全局安装的后端安装器。</w:t>
       </w:r>
     </w:p>
     <w:tbl>
@@ -317,7 +319,7 @@
                 <w:rFonts w:ascii="Consolas" w:hAnsi="Consolas"/>
                 <w:sz w:val="18"/>
               </w:rPr>
-              <w:t>node SillyTavern/public/scripts/extensions/third-party/theater-favorites/install-server-plugin.js</w:t>
+              <w:t>cd ~/SillyTavern &amp;&amp; find data public -type f -path '*sillytavern-theater-favorites/install-server-plugin.js' -exec node {} \; -quit 2&gt;/dev/null</w:t>
             </w:r>
           </w:p>
         </w:tc>
@@ -363,10 +365,9 @@
               </w:rPr>
               <w:t>提示</w:t>
               <w:br/>
+              <w:t>如果命令没有输出，请确认当前目录是 SillyTavern 根目录，并检查前端扩展是否完整安装在 sillytavern-theater-favorites 文件夹中。</w:t>
             </w:r>
-            <w:r>
-              <w:t>如果命令说找不到文件，通常只是 SillyTavern 文件夹不在当前目录。先进入存放 SillyTavern 的目录，再运行同一条命令。</w:t>
-            </w:r>
+            <w:r/>
           </w:p>
         </w:tc>
       </w:tr>
@@ -407,7 +408,7 @@
     </w:p>
     <w:p>
       <w:r>
-        <w:t>进入包含 SillyTavern 文件夹的目录后运行：</w:t>
+        <w:t>复制下面完整一行运行；请先把开头的路径改成你的 SillyTavern 实际安装位置。</w:t>
       </w:r>
     </w:p>
     <w:tbl>
@@ -433,7 +434,7 @@
                 <w:rFonts w:ascii="Consolas" w:hAnsi="Consolas"/>
                 <w:sz w:val="18"/>
               </w:rPr>
-              <w:t>node SillyTavern/public/scripts/extensions/third-party/theater-favorites/install-server-plugin.js</w:t>
+              <w:t>cd /你的实际路径/SillyTavern &amp;&amp; find data public -type f -path '*sillytavern-theater-favorites/install-server-plugin.js' -exec node {} \; -quit 2&gt;/dev/null</w:t>
             </w:r>
           </w:p>
         </w:tc>

</xml_diff>